<commit_message>
memo: GPS+radar layout round 2, index re-audited
</commit_message>
<xml_diff>
--- a/docs/radar-section.docx
+++ b/docs/radar-section.docx
@@ -1784,6 +1784,30 @@
           <w:rStyle w:val="BlueLabel"/>
           <w:lang w:val="ar"/>
         </w:rPr>
+        <w:t xml:space="preserve">أين يقع كل منهما في مسار الموجة؟</w:t>
+      </w:r>
+      <w:r>
+        <w:rPr>
+          <w:lang w:val="ar"/>
+        </w:rPr>
+        <w:t xml:space="preserve"> </w:t>
+      </w:r>
+      <w:r>
+        <w:rPr>
+          <w:lang w:val="ar"/>
+        </w:rPr>
+        <w:t xml:space="preserve">الترتيب من المرسل إلى الشاشة: الماغنترون ← الدليل الموجي ← الدوبلكسر ← الهوائي، ثم في طريق العودة: الهوائي ← الدوبلكسر ← الليمتر ← المستقبل ← IF بورد ← معالج الإشارة ← الشاشة. فالدوبلكسر نقطة الالتقاء الوحيدة بين مسار الإرسال ومسار الاستقبال، والليمتر أول قطعة بعده في مسار الاستقبال.</w:t>
+      </w:r>
+    </w:p>
+    <w:p>
+      <w:pPr>
+        <w:pStyle w:val="BodyText"/>
+      </w:pPr>
+      <w:r>
+        <w:rPr>
+          <w:rStyle w:val="BlueLabel"/>
+          <w:lang w:val="ar"/>
+        </w:rPr>
         <w:t xml:space="preserve">علامة عطل مرتبطة بهما :</w:t>
       </w:r>
       <w:r>
@@ -2325,14 +2349,14 @@
             <w:r>
               <w:drawing>
                 <wp:inline>
-                  <wp:extent cx="2667000" cy="1589741"/>
+                  <wp:extent cx="2667000" cy="1351557"/>
                   <wp:effectExtent b="0" l="0" r="0" t="0"/>
                   <wp:docPr descr="" title="" id="65" name="Picture"/>
                   <a:graphic>
                     <a:graphicData uri="http://schemas.openxmlformats.org/drawingml/2006/picture">
                       <pic:pic>
                         <pic:nvPicPr>
-                          <pic:cNvPr descr="img/tampa-radome-close.jpg" id="66" name="Picture"/>
+                          <pic:cNvPr descr="img/radome-4kw-commons.jpg" id="66" name="Picture"/>
                           <pic:cNvPicPr>
                             <a:picLocks noChangeArrowheads="1" noChangeAspect="1"/>
                           </pic:cNvPicPr>
@@ -2346,7 +2370,7 @@
                         <pic:spPr bwMode="auto">
                           <a:xfrm>
                             <a:off x="0" y="0"/>
-                            <a:ext cx="2667000" cy="1589741"/>
+                            <a:ext cx="2667000" cy="1351557"/>
                           </a:xfrm>
                           <a:prstGeom prst="rect">
                             <a:avLst/>
@@ -2379,7 +2403,7 @@
                 <w:iCs/>
                 <w:lang w:val="ar"/>
               </w:rPr>
-              <w:t xml:space="preserve">رادوم رادار ماغنترون 4 kW مركّب على قوس إحدى دورياتنا</w:t>
+              <w:t xml:space="preserve">رادوم رادار ماغنترون (4 kW) مركّب أعلى زورق صغير</w:t>
             </w:r>
           </w:p>
         </w:tc>
@@ -5565,7 +5589,7 @@
             <w:r>
               <w:drawing>
                 <wp:inline>
-                  <wp:extent cx="2667000" cy="1201816"/>
+                  <wp:extent cx="2667000" cy="1913819"/>
                   <wp:effectExtent b="0" l="0" r="0" t="0"/>
                   <wp:docPr descr="" title="" id="103" name="Picture"/>
                   <a:graphic>
@@ -5586,7 +5610,7 @@
                         <pic:spPr bwMode="auto">
                           <a:xfrm>
                             <a:off x="0" y="0"/>
-                            <a:ext cx="2667000" cy="1201816"/>
+                            <a:ext cx="2667000" cy="1913819"/>
                           </a:xfrm>
                           <a:prstGeom prst="rect">
                             <a:avLst/>

</xml_diff>